<commit_message>
feat(fase 2): decisiones del punto de control y cierre de la plantilla v1
- Antes/durante/después en disposición 2 + 1 (como Virtual), con fotos de
  8 × 6 cm; la fila superior se mantiene con la de «después».
- Foto sola de la última fila de la cuadrícula, centrada.
- Diseño D5 actualizado; tarea 2.7 cerrada; resumen y HISTORIAL.
</commit_message>
<xml_diff>
--- a/src/lib/server/plantillas/FOR-ICSI-RMT-01.v1.docx
+++ b/src/lib/server/plantillas/FOR-ICSI-RMT-01.v1.docx
@@ -1776,7 +1776,8 @@
       <w:tr>
         <w:tc>
           <w:tcPr>
-            <w:tcW w:w="4702" w:type="dxa"/>
+            <w:tcW w:w="9404" w:type="dxa"/>
+            <w:gridSpan w:val="2"/>
             <w:vAlign w:val="bottom"/>
           </w:tcPr>
           <w:p>
@@ -1786,12 +1787,20 @@
             </w:r>
           </w:p>
         </w:tc>
-        <w:tc>
-          <w:tcPr>
-            <w:tcW w:w="4702" w:type="dxa"/>
+      </w:tr>
+      <w:tr>
+        <w:tc>
+          <w:tcPr>
+            <w:tcW w:w="9404" w:type="dxa"/>
+            <w:gridSpan w:val="2"/>
             <w:vAlign w:val="bottom"/>
           </w:tcPr>
-          <w:p/>
+          <w:p>
+            <w:pPr/>
+            <w:r>
+              <w:t xml:space="preserve">+++IF !!$f.der+++</w:t>
+            </w:r>
+          </w:p>
         </w:tc>
       </w:tr>
       <w:tr>
@@ -1866,22 +1875,99 @@
       <w:tr>
         <w:tc>
           <w:tcPr>
-            <w:tcW w:w="4702" w:type="dxa"/>
+            <w:tcW w:w="9404" w:type="dxa"/>
+            <w:gridSpan w:val="2"/>
             <w:vAlign w:val="bottom"/>
           </w:tcPr>
           <w:p>
             <w:pPr/>
             <w:r>
+              <w:t xml:space="preserve">+++END-IF+++</w:t>
+            </w:r>
+          </w:p>
+        </w:tc>
+      </w:tr>
+      <w:tr>
+        <w:tc>
+          <w:tcPr>
+            <w:tcW w:w="9404" w:type="dxa"/>
+            <w:gridSpan w:val="2"/>
+            <w:vAlign w:val="bottom"/>
+          </w:tcPr>
+          <w:p>
+            <w:pPr/>
+            <w:r>
+              <w:t xml:space="preserve">+++IF !$f.der+++</w:t>
+            </w:r>
+          </w:p>
+        </w:tc>
+      </w:tr>
+      <w:tr>
+        <w:trPr>
+          <w:cantSplit/>
+        </w:trPr>
+        <w:tc>
+          <w:tcPr>
+            <w:tcW w:w="9404" w:type="dxa"/>
+            <w:gridSpan w:val="2"/>
+            <w:vAlign w:val="bottom"/>
+          </w:tcPr>
+          <w:p>
+            <w:pPr>
+              <w:pStyle w:val="NewNormal"/>
+              <w:spacing w:before="120" w:after="0"/>
+              <w:jc w:val="center"/>
+            </w:pPr>
+            <w:r>
+              <w:t xml:space="preserve">+++IF !!$f.izq+++</w:t>
+            </w:r>
+            <w:r>
+              <w:t xml:space="preserve">+++IMAGE $f.izq.imagen+++</w:t>
+            </w:r>
+            <w:r>
+              <w:t xml:space="preserve">+++END-IF+++</w:t>
+            </w:r>
+          </w:p>
+          <w:p>
+            <w:pPr>
+              <w:pStyle w:val="Descripcin"/>
+              <w:spacing w:before="40" w:after="160"/>
+              <w:jc w:val="center"/>
+            </w:pPr>
+            <w:r>
+              <w:t xml:space="preserve">+++INS $f.izq ? $f.izq.pie : ''+++</w:t>
+            </w:r>
+          </w:p>
+        </w:tc>
+      </w:tr>
+      <w:tr>
+        <w:tc>
+          <w:tcPr>
+            <w:tcW w:w="9404" w:type="dxa"/>
+            <w:gridSpan w:val="2"/>
+            <w:vAlign w:val="bottom"/>
+          </w:tcPr>
+          <w:p>
+            <w:pPr/>
+            <w:r>
+              <w:t xml:space="preserve">+++END-IF+++</w:t>
+            </w:r>
+          </w:p>
+        </w:tc>
+      </w:tr>
+      <w:tr>
+        <w:tc>
+          <w:tcPr>
+            <w:tcW w:w="9404" w:type="dxa"/>
+            <w:gridSpan w:val="2"/>
+            <w:vAlign w:val="bottom"/>
+          </w:tcPr>
+          <w:p>
+            <w:pPr/>
+            <w:r>
               <w:t xml:space="preserve">+++END-FOR f+++</w:t>
             </w:r>
           </w:p>
-        </w:tc>
-        <w:tc>
-          <w:tcPr>
-            <w:tcW w:w="4702" w:type="dxa"/>
-            <w:vAlign w:val="bottom"/>
-          </w:tcPr>
-          <w:p/>
         </w:tc>
       </w:tr>
     </w:tbl>
@@ -1900,7 +1986,7 @@
     <w:tbl>
       <w:tblPr>
         <w:tblStyle w:val="Tablaconcuadrcula"/>
-        <w:tblW w:w="9402" w:type="dxa"/>
+        <w:tblW w:w="9404" w:type="dxa"/>
         <w:jc w:val="center"/>
         <w:tblBorders>
           <w:top w:val="none" w:sz="0" w:space="0" w:color="auto"/>
@@ -1914,14 +2000,14 @@
         <w:tblLook w:val="04A0" w:firstRow="0" w:lastRow="0" w:firstColumn="0" w:lastColumn="0" w:noHBand="1" w:noVBand="1"/>
       </w:tblPr>
       <w:tblGrid>
-        <w:gridCol w:w="3134"/>
-        <w:gridCol w:w="3134"/>
-        <w:gridCol w:w="3134"/>
+        <w:gridCol w:w="4702"/>
+        <w:gridCol w:w="4702"/>
       </w:tblGrid>
       <w:tr>
         <w:tc>
           <w:tcPr>
-            <w:tcW w:w="3134" w:type="dxa"/>
+            <w:tcW w:w="9404" w:type="dxa"/>
+            <w:gridSpan w:val="2"/>
             <w:vAlign w:val="bottom"/>
           </w:tcPr>
           <w:p>
@@ -1931,19 +2017,20 @@
             </w:r>
           </w:p>
         </w:tc>
-        <w:tc>
-          <w:tcPr>
-            <w:tcW w:w="3134" w:type="dxa"/>
+      </w:tr>
+      <w:tr>
+        <w:tc>
+          <w:tcPr>
+            <w:tcW w:w="9404" w:type="dxa"/>
+            <w:gridSpan w:val="2"/>
             <w:vAlign w:val="bottom"/>
           </w:tcPr>
-          <w:p/>
-        </w:tc>
-        <w:tc>
-          <w:tcPr>
-            <w:tcW w:w="3134" w:type="dxa"/>
-            <w:vAlign w:val="bottom"/>
-          </w:tcPr>
-          <w:p/>
+          <w:p>
+            <w:pPr/>
+            <w:r>
+              <w:t xml:space="preserve">+++IF !!($f.antes || $f.durante)+++</w:t>
+            </w:r>
+          </w:p>
         </w:tc>
       </w:tr>
       <w:tr>
@@ -1952,7 +2039,139 @@
         </w:trPr>
         <w:tc>
           <w:tcPr>
-            <w:tcW w:w="3134" w:type="dxa"/>
+            <w:tcW w:w="4702" w:type="dxa"/>
+            <w:vAlign w:val="bottom"/>
+          </w:tcPr>
+          <w:p>
+            <w:pPr>
+              <w:pStyle w:val="NewNormal"/>
+              <w:keepNext/>
+              <w:spacing w:before="120" w:after="40"/>
+              <w:jc w:val="center"/>
+            </w:pPr>
+            <w:r>
+              <w:rPr>
+                <w:b/>
+              </w:rPr>
+              <w:t xml:space="preserve">+++INS $f.antes ? 'ANTES' : ''+++</w:t>
+            </w:r>
+          </w:p>
+          <w:p>
+            <w:pPr>
+              <w:pStyle w:val="NewNormal"/>
+              <w:keepNext/>
+              <w:spacing w:before="120" w:after="0"/>
+              <w:jc w:val="center"/>
+            </w:pPr>
+            <w:r>
+              <w:t xml:space="preserve">+++IF !!$f.antes+++</w:t>
+            </w:r>
+            <w:r>
+              <w:t xml:space="preserve">+++IMAGE $f.antes.imagen+++</w:t>
+            </w:r>
+            <w:r>
+              <w:t xml:space="preserve">+++END-IF+++</w:t>
+            </w:r>
+          </w:p>
+          <w:p>
+            <w:pPr>
+              <w:pStyle w:val="Descripcin"/>
+              <w:keepNext/>
+              <w:spacing w:before="40" w:after="160"/>
+              <w:jc w:val="center"/>
+            </w:pPr>
+            <w:r>
+              <w:t xml:space="preserve">+++INS $f.antes ? $f.antes.pie : ''+++</w:t>
+            </w:r>
+          </w:p>
+        </w:tc>
+        <w:tc>
+          <w:tcPr>
+            <w:tcW w:w="4702" w:type="dxa"/>
+            <w:vAlign w:val="bottom"/>
+          </w:tcPr>
+          <w:p>
+            <w:pPr>
+              <w:pStyle w:val="NewNormal"/>
+              <w:keepNext/>
+              <w:spacing w:before="120" w:after="40"/>
+              <w:jc w:val="center"/>
+            </w:pPr>
+            <w:r>
+              <w:rPr>
+                <w:b/>
+              </w:rPr>
+              <w:t xml:space="preserve">+++INS $f.durante ? 'DURANTE' : ''+++</w:t>
+            </w:r>
+          </w:p>
+          <w:p>
+            <w:pPr>
+              <w:pStyle w:val="NewNormal"/>
+              <w:keepNext/>
+              <w:spacing w:before="120" w:after="0"/>
+              <w:jc w:val="center"/>
+            </w:pPr>
+            <w:r>
+              <w:t xml:space="preserve">+++IF !!$f.durante+++</w:t>
+            </w:r>
+            <w:r>
+              <w:t xml:space="preserve">+++IMAGE $f.durante.imagen+++</w:t>
+            </w:r>
+            <w:r>
+              <w:t xml:space="preserve">+++END-IF+++</w:t>
+            </w:r>
+          </w:p>
+          <w:p>
+            <w:pPr>
+              <w:pStyle w:val="Descripcin"/>
+              <w:keepNext/>
+              <w:spacing w:before="40" w:after="160"/>
+              <w:jc w:val="center"/>
+            </w:pPr>
+            <w:r>
+              <w:t xml:space="preserve">+++INS $f.durante ? $f.durante.pie : ''+++</w:t>
+            </w:r>
+          </w:p>
+        </w:tc>
+      </w:tr>
+      <w:tr>
+        <w:tc>
+          <w:tcPr>
+            <w:tcW w:w="9404" w:type="dxa"/>
+            <w:gridSpan w:val="2"/>
+            <w:vAlign w:val="bottom"/>
+          </w:tcPr>
+          <w:p>
+            <w:pPr/>
+            <w:r>
+              <w:t xml:space="preserve">+++END-IF+++</w:t>
+            </w:r>
+          </w:p>
+        </w:tc>
+      </w:tr>
+      <w:tr>
+        <w:tc>
+          <w:tcPr>
+            <w:tcW w:w="9404" w:type="dxa"/>
+            <w:gridSpan w:val="2"/>
+            <w:vAlign w:val="bottom"/>
+          </w:tcPr>
+          <w:p>
+            <w:pPr/>
+            <w:r>
+              <w:t xml:space="preserve">+++IF !!$f.despues+++</w:t>
+            </w:r>
+          </w:p>
+        </w:tc>
+      </w:tr>
+      <w:tr>
+        <w:trPr>
+          <w:cantSplit/>
+        </w:trPr>
+        <w:tc>
+          <w:tcPr>
+            <w:tcW w:w="9404" w:type="dxa"/>
+            <w:gridSpan w:val="2"/>
             <w:vAlign w:val="bottom"/>
           </w:tcPr>
           <w:p>
@@ -1965,7 +2184,7 @@
               <w:rPr>
                 <w:b/>
               </w:rPr>
-              <w:t xml:space="preserve">+++INS $f.antes ? 'ANTES' : ''+++</w:t>
+              <w:t xml:space="preserve">+++INS $f.despues ? 'DESPUÉS' : ''+++</w:t>
             </w:r>
           </w:p>
           <w:p>
@@ -1975,10 +2194,10 @@
               <w:jc w:val="center"/>
             </w:pPr>
             <w:r>
-              <w:t xml:space="preserve">+++IF !!$f.antes+++</w:t>
-            </w:r>
-            <w:r>
-              <w:t xml:space="preserve">+++IMAGE $f.antes.imagen+++</w:t>
+              <w:t xml:space="preserve">+++IF !!$f.despues+++</w:t>
+            </w:r>
+            <w:r>
+              <w:t xml:space="preserve">+++IMAGE $f.despues.imagen+++</w:t>
             </w:r>
             <w:r>
               <w:t xml:space="preserve">+++END-IF+++</w:t>
@@ -1991,96 +2210,6 @@
               <w:jc w:val="center"/>
             </w:pPr>
             <w:r>
-              <w:t xml:space="preserve">+++INS $f.antes ? $f.antes.pie : ''+++</w:t>
-            </w:r>
-          </w:p>
-        </w:tc>
-        <w:tc>
-          <w:tcPr>
-            <w:tcW w:w="3134" w:type="dxa"/>
-            <w:vAlign w:val="bottom"/>
-          </w:tcPr>
-          <w:p>
-            <w:pPr>
-              <w:pStyle w:val="NewNormal"/>
-              <w:spacing w:before="120" w:after="40"/>
-              <w:jc w:val="center"/>
-            </w:pPr>
-            <w:r>
-              <w:rPr>
-                <w:b/>
-              </w:rPr>
-              <w:t xml:space="preserve">+++INS $f.durante ? 'DURANTE' : ''+++</w:t>
-            </w:r>
-          </w:p>
-          <w:p>
-            <w:pPr>
-              <w:pStyle w:val="NewNormal"/>
-              <w:spacing w:before="120" w:after="0"/>
-              <w:jc w:val="center"/>
-            </w:pPr>
-            <w:r>
-              <w:t xml:space="preserve">+++IF !!$f.durante+++</w:t>
-            </w:r>
-            <w:r>
-              <w:t xml:space="preserve">+++IMAGE $f.durante.imagen+++</w:t>
-            </w:r>
-            <w:r>
-              <w:t xml:space="preserve">+++END-IF+++</w:t>
-            </w:r>
-          </w:p>
-          <w:p>
-            <w:pPr>
-              <w:pStyle w:val="Descripcin"/>
-              <w:spacing w:before="40" w:after="160"/>
-              <w:jc w:val="center"/>
-            </w:pPr>
-            <w:r>
-              <w:t xml:space="preserve">+++INS $f.durante ? $f.durante.pie : ''+++</w:t>
-            </w:r>
-          </w:p>
-        </w:tc>
-        <w:tc>
-          <w:tcPr>
-            <w:tcW w:w="3134" w:type="dxa"/>
-            <w:vAlign w:val="bottom"/>
-          </w:tcPr>
-          <w:p>
-            <w:pPr>
-              <w:pStyle w:val="NewNormal"/>
-              <w:spacing w:before="120" w:after="40"/>
-              <w:jc w:val="center"/>
-            </w:pPr>
-            <w:r>
-              <w:rPr>
-                <w:b/>
-              </w:rPr>
-              <w:t xml:space="preserve">+++INS $f.despues ? 'DESPUÉS' : ''+++</w:t>
-            </w:r>
-          </w:p>
-          <w:p>
-            <w:pPr>
-              <w:pStyle w:val="NewNormal"/>
-              <w:spacing w:before="120" w:after="0"/>
-              <w:jc w:val="center"/>
-            </w:pPr>
-            <w:r>
-              <w:t xml:space="preserve">+++IF !!$f.despues+++</w:t>
-            </w:r>
-            <w:r>
-              <w:t xml:space="preserve">+++IMAGE $f.despues.imagen+++</w:t>
-            </w:r>
-            <w:r>
-              <w:t xml:space="preserve">+++END-IF+++</w:t>
-            </w:r>
-          </w:p>
-          <w:p>
-            <w:pPr>
-              <w:pStyle w:val="Descripcin"/>
-              <w:spacing w:before="40" w:after="160"/>
-              <w:jc w:val="center"/>
-            </w:pPr>
-            <w:r>
               <w:t xml:space="preserve">+++INS $f.despues ? $f.despues.pie : ''+++</w:t>
             </w:r>
           </w:p>
@@ -2089,29 +2218,31 @@
       <w:tr>
         <w:tc>
           <w:tcPr>
-            <w:tcW w:w="3134" w:type="dxa"/>
+            <w:tcW w:w="9404" w:type="dxa"/>
+            <w:gridSpan w:val="2"/>
             <w:vAlign w:val="bottom"/>
           </w:tcPr>
           <w:p>
             <w:pPr/>
             <w:r>
+              <w:t xml:space="preserve">+++END-IF+++</w:t>
+            </w:r>
+          </w:p>
+        </w:tc>
+      </w:tr>
+      <w:tr>
+        <w:tc>
+          <w:tcPr>
+            <w:tcW w:w="9404" w:type="dxa"/>
+            <w:gridSpan w:val="2"/>
+            <w:vAlign w:val="bottom"/>
+          </w:tcPr>
+          <w:p>
+            <w:pPr/>
+            <w:r>
               <w:t xml:space="preserve">+++END-FOR f+++</w:t>
             </w:r>
           </w:p>
-        </w:tc>
-        <w:tc>
-          <w:tcPr>
-            <w:tcW w:w="3134" w:type="dxa"/>
-            <w:vAlign w:val="bottom"/>
-          </w:tcPr>
-          <w:p/>
-        </w:tc>
-        <w:tc>
-          <w:tcPr>
-            <w:tcW w:w="3134" w:type="dxa"/>
-            <w:vAlign w:val="bottom"/>
-          </w:tcPr>
-          <w:p/>
         </w:tc>
       </w:tr>
     </w:tbl>

</xml_diff>